<commit_message>
docs: add 12-slide presentation (.pptx); update TZ section 15 with link; drop date from header
</commit_message>
<xml_diff>
--- a/docs/TZ_marketplace.docx
+++ b/docs/TZ_marketplace.docx
@@ -35,13 +35,6 @@
           <w:i/>
         </w:rPr>
         <w:t>Виконавець: Горбунова Крістіна, група УМ-з31</w:t>
-        <w:br/>
-      </w:r>
-      <w:r>
-        <w:rPr>
-          <w:i/>
-        </w:rPr>
-        <w:t>Травень 2026</w:t>
       </w:r>
     </w:p>
     <w:p/>
@@ -1018,10 +1011,46 @@
       </w:pPr>
       <w:r>
         <w:rPr>
-          <w:i/>
+          <w:i w:val="0"/>
           <w:sz w:val="22"/>
         </w:rPr>
-        <w:t>У розробці. Посилання на слайди для захисту проекту буде додано до фінального дедлайну (30 червня 2026). Місце збереження: спільний Google Drive команди.</w:t>
+        <w:t>Слайди для захисту проекту (12 слайдів, .pptx): структура — бізнес-проблема, дані, модель, метрики, формула замовлення, бізнес-ефект, висновки.</w:t>
+      </w:r>
+    </w:p>
+    <w:p>
+      <w:pPr>
+        <w:spacing w:after="40"/>
+      </w:pPr>
+      <w:r>
+        <w:rPr>
+          <w:b/>
+          <w:sz w:val="22"/>
+        </w:rPr>
+        <w:t xml:space="preserve">Файл презентації: </w:t>
+      </w:r>
+      <w:r>
+        <w:rPr>
+          <w:sz w:val="22"/>
+        </w:rPr>
+        <w:t>https://github.com/kgorbunova3/sku-sales-forecast/blob/main/docs/presentation.pptx</w:t>
+      </w:r>
+    </w:p>
+    <w:p>
+      <w:pPr>
+        <w:spacing w:after="40"/>
+      </w:pPr>
+      <w:r>
+        <w:rPr>
+          <w:b/>
+          <w:sz w:val="22"/>
+        </w:rPr>
+        <w:t xml:space="preserve">Пряме завантаження: </w:t>
+      </w:r>
+      <w:r>
+        <w:rPr>
+          <w:sz w:val="22"/>
+        </w:rPr>
+        <w:t>https://github.com/kgorbunova3/sku-sales-forecast/raw/main/docs/presentation.pptx</w:t>
       </w:r>
     </w:p>
     <w:p>

</xml_diff>